<commit_message>
Labs por aula e parte no Codespaces, labs GitHub e migração para o GitHub
- Labs-streamlit reorganizado em Aula0X/ParteN (12-15 min cada) rodando
  no GitHub Codespaces.
- Labs AWS substituídos por labs GitHub: CI do app com AppTest, imagem
  no GitHub Container Registry, monitoramento de drift agendado com
  issue de alerta e pipeline DVC no CI com métricas no pull request.
- Slides: agenda, slide do lab e passos da Parte 3 alinhados aos labs
  GitHub; Aula04 com aliases do MLflow.
- Apostilas Aula03 (Evidently 0.7) e Aula04 (aliases e name= no MLflow).
- .devcontainer e .gitignore na raiz; README com links do GitHub e sem
  pré-requisitos de AWS.

Co-Authored-By: Claude Opus 5.5 <noreply@anthropic.com>
</commit_message>
<xml_diff>
--- a/Docs-Aulas-streamlit/capitulos/Aula03_Monitoramento_Drift.docx
+++ b/Docs-Aulas-streamlit/capitulos/Aula03_Monitoramento_Drift.docx
@@ -172,21 +172,7 @@
           <w:b/>
         </w:rPr>
         <w:lastRenderedPageBreak/>
-        <w:t>HISTÓRI</w:t>
-      </w:r>
-      <w:r>
-        <w:rPr>
-          <w:rStyle w:val="SubTtulo-AutoreVersoChar"/>
-          <w:b/>
-        </w:rPr>
-        <w:t>C</w:t>
-      </w:r>
-      <w:r>
-        <w:rPr>
-          <w:rStyle w:val="SubTtulo-AutoreVersoChar"/>
-          <w:b/>
-        </w:rPr>
-        <w:t>O DE REVISÕES</w:t>
+        <w:t>HISTÓRICO DE REVISÕES</w:t>
       </w:r>
     </w:p>
     <w:tbl>
@@ -381,15 +367,11 @@
           </w:tcPr>
           <w:p>
             <w:pPr>
-              <w:pStyle w:val="NormalTabela"/>
-              <w:rPr>
-                <w:rStyle w:val="SubTtulo-AutoreVersoChar"/>
-                <w:b w:val="0"/>
-                <w:bCs w:val="0"/>
-                <w:sz w:val="20"/>
-                <w:szCs w:val="16"/>
-              </w:rPr>
+              <w:ind w:firstLine="0"/>
             </w:pPr>
+            <w:r>
+              <w:t>2</w:t>
+            </w:r>
           </w:p>
         </w:tc>
         <w:tc>
@@ -397,16 +379,9 @@
             <w:tcW w:w="1174" w:type="pct"/>
           </w:tcPr>
           <w:p>
-            <w:pPr>
-              <w:pStyle w:val="NormalTabela"/>
-              <w:rPr>
-                <w:rStyle w:val="SubTtulo-AutoreVersoChar"/>
-                <w:b w:val="0"/>
-                <w:bCs w:val="0"/>
-                <w:sz w:val="20"/>
-                <w:szCs w:val="16"/>
-              </w:rPr>
-            </w:pPr>
+            <w:r>
+              <w:t>28/09/2026</w:t>
+            </w:r>
           </w:p>
         </w:tc>
         <w:tc>
@@ -415,15 +390,11 @@
           </w:tcPr>
           <w:p>
             <w:pPr>
-              <w:pStyle w:val="NormalTabela"/>
-              <w:rPr>
-                <w:rStyle w:val="SubTtulo-AutoreVersoChar"/>
-                <w:b w:val="0"/>
-                <w:bCs w:val="0"/>
-                <w:sz w:val="20"/>
-                <w:szCs w:val="16"/>
-              </w:rPr>
+              <w:ind w:firstLine="0"/>
             </w:pPr>
+            <w:r>
+              <w:t>Rafael Tavares</w:t>
+            </w:r>
           </w:p>
         </w:tc>
         <w:tc>
@@ -432,15 +403,11 @@
           </w:tcPr>
           <w:p>
             <w:pPr>
-              <w:pStyle w:val="NormalTabela"/>
-              <w:rPr>
-                <w:rStyle w:val="SubTtulo-AutoreVersoChar"/>
-                <w:b w:val="0"/>
-                <w:bCs w:val="0"/>
-                <w:sz w:val="20"/>
-                <w:szCs w:val="16"/>
-              </w:rPr>
+              <w:ind w:firstLine="0"/>
             </w:pPr>
+            <w:r>
+              <w:t>Atualização do exemplo do Evidently para a API 0.7+</w:t>
+            </w:r>
           </w:p>
         </w:tc>
       </w:tr>
@@ -1015,23 +982,7 @@
                                 <w:rFonts w:eastAsia="Arial"/>
                                 <w:sz w:val="18"/>
                               </w:rPr>
-                              <w:t xml:space="preserve">                  Título [livro eletrônico] / Nome Sobrenome. -- São </w:t>
-                            </w:r>
-                            <w:proofErr w:type="gramStart"/>
-                            <w:r>
-                              <w:rPr>
-                                <w:rFonts w:eastAsia="Arial"/>
-                                <w:sz w:val="18"/>
-                              </w:rPr>
-                              <w:t>Paulo :</w:t>
-                            </w:r>
-                            <w:proofErr w:type="gramEnd"/>
-                            <w:r>
-                              <w:rPr>
-                                <w:rFonts w:eastAsia="Arial"/>
-                                <w:sz w:val="18"/>
-                              </w:rPr>
-                              <w:t xml:space="preserve"> Fiap, 2016.</w:t>
+                              <w:t xml:space="preserve">                  Título [livro eletrônico] / Nome Sobrenome. -- São Paulo : Fiap, 2016.</w:t>
                             </w:r>
                           </w:p>
                           <w:p>
@@ -1047,33 +998,8 @@
                                 <w:rFonts w:eastAsia="Arial"/>
                                 <w:sz w:val="18"/>
                               </w:rPr>
-                              <w:t xml:space="preserve">                   x </w:t>
+                              <w:t xml:space="preserve">                   x MB ; ePUB</w:t>
                             </w:r>
-                            <w:proofErr w:type="gramStart"/>
-                            <w:r>
-                              <w:rPr>
-                                <w:rFonts w:eastAsia="Arial"/>
-                                <w:sz w:val="18"/>
-                              </w:rPr>
-                              <w:t>MB ;</w:t>
-                            </w:r>
-                            <w:proofErr w:type="gramEnd"/>
-                            <w:r>
-                              <w:rPr>
-                                <w:rFonts w:eastAsia="Arial"/>
-                                <w:sz w:val="18"/>
-                              </w:rPr>
-                              <w:t xml:space="preserve"> </w:t>
-                            </w:r>
-                            <w:proofErr w:type="spellStart"/>
-                            <w:r>
-                              <w:rPr>
-                                <w:rFonts w:eastAsia="Arial"/>
-                                <w:sz w:val="18"/>
-                              </w:rPr>
-                              <w:t>ePUB</w:t>
-                            </w:r>
-                            <w:proofErr w:type="spellEnd"/>
                           </w:p>
                           <w:p>
                             <w:pPr>
@@ -1310,17 +1236,8 @@
                           <w:rFonts w:eastAsia="Arial"/>
                           <w:sz w:val="18"/>
                         </w:rPr>
-                        <w:t xml:space="preserve">                   x MB ; </w:t>
+                        <w:t xml:space="preserve">                   x MB ; ePUB</w:t>
                       </w:r>
-                      <w:proofErr w:type="spellStart"/>
-                      <w:r>
-                        <w:rPr>
-                          <w:rFonts w:eastAsia="Arial"/>
-                          <w:sz w:val="18"/>
-                        </w:rPr>
-                        <w:t>ePUB</w:t>
-                      </w:r>
-                      <w:proofErr w:type="spellEnd"/>
                     </w:p>
                     <w:p>
                       <w:pPr>
@@ -1484,8 +1401,6 @@
       </w:r>
       <w:r>
         <w:t xml:space="preserve">FICHA CATALOGRÁFICA </w:t>
-      </w:r>
-      <w:r>
         <w:br/>
       </w:r>
       <w:r>
@@ -1493,21 +1408,7 @@
           <w:b/>
           <w:color w:val="FF0000"/>
         </w:rPr>
-        <w:t>[NÃO PREENCHER - PARA USO DO DEPTO DE EAD</w:t>
-      </w:r>
-      <w:r>
-        <w:rPr>
-          <w:b/>
-          <w:color w:val="FF0000"/>
-        </w:rPr>
-        <w:t xml:space="preserve"> E BIBLIOTECA</w:t>
-      </w:r>
-      <w:r>
-        <w:rPr>
-          <w:b/>
-          <w:color w:val="FF0000"/>
-        </w:rPr>
-        <w:t>]</w:t>
+        <w:t xml:space="preserve">[NÃO PREENCHER - PARA USO DO DEPTO DE EAD E BIBLIOTECA]</w:t>
       </w:r>
     </w:p>
     <w:p>
@@ -1559,11 +1460,7 @@
       </w:pPr>
       <w:r>
         <w:fldChar w:fldCharType="begin"/>
-      </w:r>
-      <w:r>
         <w:instrText xml:space="preserve"> TOC \o "1-3" \h \z \u </w:instrText>
-      </w:r>
-      <w:r>
         <w:fldChar w:fldCharType="separate"/>
       </w:r>
       <w:hyperlink w:anchor="_Toc153545379" w:history="1">
@@ -1578,40 +1475,10 @@
             <w:webHidden/>
           </w:rPr>
           <w:tab/>
-        </w:r>
-        <w:r>
-          <w:rPr>
-            <w:webHidden/>
-          </w:rPr>
           <w:fldChar w:fldCharType="begin"/>
-        </w:r>
-        <w:r>
-          <w:rPr>
-            <w:webHidden/>
-          </w:rPr>
           <w:instrText xml:space="preserve"> PAGEREF _Toc153545379 \h </w:instrText>
-        </w:r>
-        <w:r>
-          <w:rPr>
-            <w:webHidden/>
-          </w:rPr>
-        </w:r>
-        <w:r>
-          <w:rPr>
-            <w:webHidden/>
-          </w:rPr>
           <w:fldChar w:fldCharType="separate"/>
-        </w:r>
-        <w:r>
-          <w:rPr>
-            <w:webHidden/>
-          </w:rPr>
           <w:t>5</w:t>
-        </w:r>
-        <w:r>
-          <w:rPr>
-            <w:webHidden/>
-          </w:rPr>
           <w:fldChar w:fldCharType="end"/>
         </w:r>
       </w:hyperlink>
@@ -1640,40 +1507,10 @@
             <w:webHidden/>
           </w:rPr>
           <w:tab/>
-        </w:r>
-        <w:r>
-          <w:rPr>
-            <w:webHidden/>
-          </w:rPr>
           <w:fldChar w:fldCharType="begin"/>
-        </w:r>
-        <w:r>
-          <w:rPr>
-            <w:webHidden/>
-          </w:rPr>
           <w:instrText xml:space="preserve"> PAGEREF _Toc153545380 \h </w:instrText>
-        </w:r>
-        <w:r>
-          <w:rPr>
-            <w:webHidden/>
-          </w:rPr>
-        </w:r>
-        <w:r>
-          <w:rPr>
-            <w:webHidden/>
-          </w:rPr>
           <w:fldChar w:fldCharType="separate"/>
-        </w:r>
-        <w:r>
-          <w:rPr>
-            <w:webHidden/>
-          </w:rPr>
           <w:t>6</w:t>
-        </w:r>
-        <w:r>
-          <w:rPr>
-            <w:webHidden/>
-          </w:rPr>
           <w:fldChar w:fldCharType="end"/>
         </w:r>
       </w:hyperlink>
@@ -1704,46 +1541,10 @@
             <w:webHidden/>
           </w:rPr>
           <w:tab/>
-        </w:r>
-        <w:r>
-          <w:rPr>
-            <w:noProof/>
-            <w:webHidden/>
-          </w:rPr>
           <w:fldChar w:fldCharType="begin"/>
-        </w:r>
-        <w:r>
-          <w:rPr>
-            <w:noProof/>
-            <w:webHidden/>
-          </w:rPr>
           <w:instrText xml:space="preserve"> PAGEREF _Toc153545381 \h </w:instrText>
-        </w:r>
-        <w:r>
-          <w:rPr>
-            <w:noProof/>
-            <w:webHidden/>
-          </w:rPr>
-        </w:r>
-        <w:r>
-          <w:rPr>
-            <w:noProof/>
-            <w:webHidden/>
-          </w:rPr>
           <w:fldChar w:fldCharType="separate"/>
-        </w:r>
-        <w:r>
-          <w:rPr>
-            <w:noProof/>
-            <w:webHidden/>
-          </w:rPr>
           <w:t>9</w:t>
-        </w:r>
-        <w:r>
-          <w:rPr>
-            <w:noProof/>
-            <w:webHidden/>
-          </w:rPr>
           <w:fldChar w:fldCharType="end"/>
         </w:r>
       </w:hyperlink>
@@ -1774,46 +1575,10 @@
             <w:webHidden/>
           </w:rPr>
           <w:tab/>
-        </w:r>
-        <w:r>
-          <w:rPr>
-            <w:noProof/>
-            <w:webHidden/>
-          </w:rPr>
           <w:fldChar w:fldCharType="begin"/>
-        </w:r>
-        <w:r>
-          <w:rPr>
-            <w:noProof/>
-            <w:webHidden/>
-          </w:rPr>
           <w:instrText xml:space="preserve"> PAGEREF _Toc153545382 \h </w:instrText>
-        </w:r>
-        <w:r>
-          <w:rPr>
-            <w:noProof/>
-            <w:webHidden/>
-          </w:rPr>
-        </w:r>
-        <w:r>
-          <w:rPr>
-            <w:noProof/>
-            <w:webHidden/>
-          </w:rPr>
           <w:fldChar w:fldCharType="separate"/>
-        </w:r>
-        <w:r>
-          <w:rPr>
-            <w:noProof/>
-            <w:webHidden/>
-          </w:rPr>
           <w:t>17</w:t>
-        </w:r>
-        <w:r>
-          <w:rPr>
-            <w:noProof/>
-            <w:webHidden/>
-          </w:rPr>
           <w:fldChar w:fldCharType="end"/>
         </w:r>
       </w:hyperlink>
@@ -1844,46 +1609,10 @@
             <w:webHidden/>
           </w:rPr>
           <w:tab/>
-        </w:r>
-        <w:r>
-          <w:rPr>
-            <w:noProof/>
-            <w:webHidden/>
-          </w:rPr>
           <w:fldChar w:fldCharType="begin"/>
-        </w:r>
-        <w:r>
-          <w:rPr>
-            <w:noProof/>
-            <w:webHidden/>
-          </w:rPr>
           <w:instrText xml:space="preserve"> PAGEREF _Toc153545383 \h </w:instrText>
-        </w:r>
-        <w:r>
-          <w:rPr>
-            <w:noProof/>
-            <w:webHidden/>
-          </w:rPr>
-        </w:r>
-        <w:r>
-          <w:rPr>
-            <w:noProof/>
-            <w:webHidden/>
-          </w:rPr>
           <w:fldChar w:fldCharType="separate"/>
-        </w:r>
-        <w:r>
-          <w:rPr>
-            <w:noProof/>
-            <w:webHidden/>
-          </w:rPr>
           <w:t>18</w:t>
-        </w:r>
-        <w:r>
-          <w:rPr>
-            <w:noProof/>
-            <w:webHidden/>
-          </w:rPr>
           <w:fldChar w:fldCharType="end"/>
         </w:r>
       </w:hyperlink>
@@ -1913,40 +1642,10 @@
             <w:webHidden/>
           </w:rPr>
           <w:tab/>
-        </w:r>
-        <w:r>
-          <w:rPr>
-            <w:webHidden/>
-          </w:rPr>
           <w:fldChar w:fldCharType="begin"/>
-        </w:r>
-        <w:r>
-          <w:rPr>
-            <w:webHidden/>
-          </w:rPr>
           <w:instrText xml:space="preserve"> PAGEREF _Toc153545384 \h </w:instrText>
-        </w:r>
-        <w:r>
-          <w:rPr>
-            <w:webHidden/>
-          </w:rPr>
-        </w:r>
-        <w:r>
-          <w:rPr>
-            <w:webHidden/>
-          </w:rPr>
           <w:fldChar w:fldCharType="separate"/>
-        </w:r>
-        <w:r>
-          <w:rPr>
-            <w:webHidden/>
-          </w:rPr>
           <w:t>19</w:t>
-        </w:r>
-        <w:r>
-          <w:rPr>
-            <w:webHidden/>
-          </w:rPr>
           <w:fldChar w:fldCharType="end"/>
         </w:r>
       </w:hyperlink>
@@ -1975,40 +1674,10 @@
             <w:webHidden/>
           </w:rPr>
           <w:tab/>
-        </w:r>
-        <w:r>
-          <w:rPr>
-            <w:webHidden/>
-          </w:rPr>
           <w:fldChar w:fldCharType="begin"/>
-        </w:r>
-        <w:r>
-          <w:rPr>
-            <w:webHidden/>
-          </w:rPr>
           <w:instrText xml:space="preserve"> PAGEREF _Toc153545385 \h </w:instrText>
-        </w:r>
-        <w:r>
-          <w:rPr>
-            <w:webHidden/>
-          </w:rPr>
-        </w:r>
-        <w:r>
-          <w:rPr>
-            <w:webHidden/>
-          </w:rPr>
           <w:fldChar w:fldCharType="separate"/>
-        </w:r>
-        <w:r>
-          <w:rPr>
-            <w:webHidden/>
-          </w:rPr>
           <w:t>21</w:t>
-        </w:r>
-        <w:r>
-          <w:rPr>
-            <w:webHidden/>
-          </w:rPr>
           <w:fldChar w:fldCharType="end"/>
         </w:r>
       </w:hyperlink>
@@ -2171,15 +1840,7 @@
         <w:pStyle w:val="BodyText"/>
       </w:pPr>
       <w:r>
-        <w:t xml:space="preserve">Um modelo aprende uma "fotografia" do mundo: a relação entre as variáveis de entrada e o que se quer prever, </w:t>
-      </w:r>
-      <w:proofErr w:type="gramStart"/>
-      <w:r>
-        <w:t>no momento em que</w:t>
-      </w:r>
-      <w:proofErr w:type="gramEnd"/>
-      <w:r>
-        <w:t xml:space="preserve"> foi treinado. Mas o mundo é um filme, não uma foto. Conforme o tempo passa, a realidade se afasta daquela fotografia, e a qualidade das previsões cai. Esse fenômeno é inevitável — a pergunta não é *se* o modelo vai degradar, mas *quando* e *quão rápido*.</w:t>
+        <w:t xml:space="preserve">Um modelo aprende uma "fotografia" do mundo: a relação entre as variáveis de entrada e o que se quer prever, no momento em que foi treinado. Mas o mundo é um filme, não uma foto. Conforme o tempo passa, a realidade se afasta daquela fotografia, e a qualidade das previsões cai. Esse fenômeno é inevitável — a pergunta não é *se* o modelo vai degradar, mas *quando* e *quão rápido*.</w:t>
       </w:r>
     </w:p>
     <w:p>
@@ -2463,8 +2124,6 @@
       </w:r>
       <w:r>
         <w:t xml:space="preserve"> A relação entre as entradas e a saída muda. Exemplo: antes da pandemia, certas características indicavam um bom pagador; depois, </w:t>
-      </w:r>
-      <w:r>
         <w:lastRenderedPageBreak/>
         <w:t>essa relação mudou. O mesmo dado de entrada agora corresponde a um resultado diferente.</w:t>
       </w:r>
@@ -2488,15 +2147,7 @@
         <w:pStyle w:val="BodyText"/>
       </w:pPr>
       <w:r>
-        <w:t xml:space="preserve">Distinguir data drift de concept drift é importante porque a resposta é diferente: data drift pode pedir </w:t>
-      </w:r>
-      <w:proofErr w:type="gramStart"/>
-      <w:r>
-        <w:t>re-treino</w:t>
-      </w:r>
-      <w:proofErr w:type="gramEnd"/>
-      <w:r>
-        <w:t xml:space="preserve"> com dados recentes; concept drift geralmente exige repensar as features ou até o problema.</w:t>
+        <w:t xml:space="preserve">Distinguir data drift de concept drift é importante porque a resposta é diferente: data drift pode pedir re-treino com dados recentes; concept drift geralmente exige repensar as features ou até o problema.</w:t>
       </w:r>
     </w:p>
     <w:p>
@@ -2865,315 +2516,65 @@
           <w:lang w:val="pt-BR"/>
         </w:rPr>
       </w:pPr>
-      <w:proofErr w:type="spellStart"/>
       <w:r>
         <w:rPr>
           <w:rFonts w:ascii="Consolas" w:hAnsi="Consolas"/>
           <w:lang w:val="pt-BR"/>
         </w:rPr>
-        <w:t>from</w:t>
-      </w:r>
-      <w:proofErr w:type="spellEnd"/>
+        <w:t xml:space="preserve">from evidently import Report</w:t>
+      </w:r>
+      <w:r>
+        <w:rPr>
+          <w:lang w:val="pt-BR"/>
+        </w:rPr>
+        <w:br/>
+      </w:r>
       <w:r>
         <w:rPr>
           <w:rFonts w:ascii="Consolas" w:hAnsi="Consolas"/>
           <w:lang w:val="pt-BR"/>
         </w:rPr>
-        <w:t xml:space="preserve"> </w:t>
-      </w:r>
-      <w:proofErr w:type="spellStart"/>
-      <w:proofErr w:type="gramStart"/>
+        <w:t xml:space="preserve">from evidently.presets import DataDriftPreset</w:t>
+      </w:r>
+      <w:r>
+        <w:rPr>
+          <w:lang w:val="pt-BR"/>
+        </w:rPr>
+        <w:br/>
+        <w:br/>
+      </w:r>
       <w:r>
         <w:rPr>
           <w:rFonts w:ascii="Consolas" w:hAnsi="Consolas"/>
           <w:lang w:val="pt-BR"/>
         </w:rPr>
-        <w:t>evidently.report</w:t>
-      </w:r>
-      <w:proofErr w:type="spellEnd"/>
-      <w:proofErr w:type="gramEnd"/>
+        <w:t xml:space="preserve">report = Report([DataDriftPreset()])</w:t>
+      </w:r>
+      <w:r>
+        <w:rPr>
+          <w:lang w:val="pt-BR"/>
+        </w:rPr>
+        <w:br/>
+      </w:r>
       <w:r>
         <w:rPr>
           <w:rFonts w:ascii="Consolas" w:hAnsi="Consolas"/>
           <w:lang w:val="pt-BR"/>
         </w:rPr>
-        <w:t xml:space="preserve"> </w:t>
-      </w:r>
-      <w:proofErr w:type="spellStart"/>
+        <w:t xml:space="preserve">resultado = report.run(reference_data=dados_treino, current_data=dados_producao)</w:t>
+      </w:r>
+      <w:r>
+        <w:rPr>
+          <w:lang w:val="pt-BR"/>
+        </w:rPr>
+        <w:br/>
+      </w:r>
       <w:r>
         <w:rPr>
           <w:rFonts w:ascii="Consolas" w:hAnsi="Consolas"/>
           <w:lang w:val="pt-BR"/>
         </w:rPr>
-        <w:t>import</w:t>
-      </w:r>
-      <w:proofErr w:type="spellEnd"/>
-      <w:r>
-        <w:rPr>
-          <w:rFonts w:ascii="Consolas" w:hAnsi="Consolas"/>
-          <w:lang w:val="pt-BR"/>
-        </w:rPr>
-        <w:t xml:space="preserve"> Report</w:t>
-      </w:r>
-      <w:r>
-        <w:rPr>
-          <w:lang w:val="pt-BR"/>
-        </w:rPr>
-        <w:br/>
-      </w:r>
-      <w:proofErr w:type="spellStart"/>
-      <w:r>
-        <w:rPr>
-          <w:rFonts w:ascii="Consolas" w:hAnsi="Consolas"/>
-          <w:lang w:val="pt-BR"/>
-        </w:rPr>
-        <w:t>from</w:t>
-      </w:r>
-      <w:proofErr w:type="spellEnd"/>
-      <w:r>
-        <w:rPr>
-          <w:rFonts w:ascii="Consolas" w:hAnsi="Consolas"/>
-          <w:lang w:val="pt-BR"/>
-        </w:rPr>
-        <w:t xml:space="preserve"> </w:t>
-      </w:r>
-      <w:proofErr w:type="spellStart"/>
-      <w:proofErr w:type="gramStart"/>
-      <w:r>
-        <w:rPr>
-          <w:rFonts w:ascii="Consolas" w:hAnsi="Consolas"/>
-          <w:lang w:val="pt-BR"/>
-        </w:rPr>
-        <w:t>evidently.metric</w:t>
-      </w:r>
-      <w:proofErr w:type="gramEnd"/>
-      <w:r>
-        <w:rPr>
-          <w:rFonts w:ascii="Consolas" w:hAnsi="Consolas"/>
-          <w:lang w:val="pt-BR"/>
-        </w:rPr>
-        <w:t>_preset</w:t>
-      </w:r>
-      <w:proofErr w:type="spellEnd"/>
-      <w:r>
-        <w:rPr>
-          <w:rFonts w:ascii="Consolas" w:hAnsi="Consolas"/>
-          <w:lang w:val="pt-BR"/>
-        </w:rPr>
-        <w:t xml:space="preserve"> </w:t>
-      </w:r>
-      <w:proofErr w:type="spellStart"/>
-      <w:r>
-        <w:rPr>
-          <w:rFonts w:ascii="Consolas" w:hAnsi="Consolas"/>
-          <w:lang w:val="pt-BR"/>
-        </w:rPr>
-        <w:t>import</w:t>
-      </w:r>
-      <w:proofErr w:type="spellEnd"/>
-      <w:r>
-        <w:rPr>
-          <w:rFonts w:ascii="Consolas" w:hAnsi="Consolas"/>
-          <w:lang w:val="pt-BR"/>
-        </w:rPr>
-        <w:t xml:space="preserve"> </w:t>
-      </w:r>
-      <w:proofErr w:type="spellStart"/>
-      <w:r>
-        <w:rPr>
-          <w:rFonts w:ascii="Consolas" w:hAnsi="Consolas"/>
-          <w:lang w:val="pt-BR"/>
-        </w:rPr>
-        <w:t>DataDriftPreset</w:t>
-      </w:r>
-      <w:proofErr w:type="spellEnd"/>
-      <w:r>
-        <w:rPr>
-          <w:lang w:val="pt-BR"/>
-        </w:rPr>
-        <w:br/>
-      </w:r>
-      <w:r>
-        <w:rPr>
-          <w:lang w:val="pt-BR"/>
-        </w:rPr>
-        <w:br/>
-      </w:r>
-      <w:proofErr w:type="spellStart"/>
-      <w:r>
-        <w:rPr>
-          <w:rFonts w:ascii="Consolas" w:hAnsi="Consolas"/>
-          <w:lang w:val="pt-BR"/>
-        </w:rPr>
-        <w:t>report</w:t>
-      </w:r>
-      <w:proofErr w:type="spellEnd"/>
-      <w:r>
-        <w:rPr>
-          <w:rFonts w:ascii="Consolas" w:hAnsi="Consolas"/>
-          <w:lang w:val="pt-BR"/>
-        </w:rPr>
-        <w:t xml:space="preserve"> = Report(</w:t>
-      </w:r>
-      <w:proofErr w:type="spellStart"/>
-      <w:r>
-        <w:rPr>
-          <w:rFonts w:ascii="Consolas" w:hAnsi="Consolas"/>
-          <w:lang w:val="pt-BR"/>
-        </w:rPr>
-        <w:t>metrics</w:t>
-      </w:r>
-      <w:proofErr w:type="spellEnd"/>
-      <w:r>
-        <w:rPr>
-          <w:rFonts w:ascii="Consolas" w:hAnsi="Consolas"/>
-          <w:lang w:val="pt-BR"/>
-        </w:rPr>
-        <w:t>=[</w:t>
-      </w:r>
-      <w:proofErr w:type="spellStart"/>
-      <w:proofErr w:type="gramStart"/>
-      <w:r>
-        <w:rPr>
-          <w:rFonts w:ascii="Consolas" w:hAnsi="Consolas"/>
-          <w:lang w:val="pt-BR"/>
-        </w:rPr>
-        <w:t>DataDriftPreset</w:t>
-      </w:r>
-      <w:proofErr w:type="spellEnd"/>
-      <w:r>
-        <w:rPr>
-          <w:rFonts w:ascii="Consolas" w:hAnsi="Consolas"/>
-          <w:lang w:val="pt-BR"/>
-        </w:rPr>
-        <w:t>(</w:t>
-      </w:r>
-      <w:proofErr w:type="gramEnd"/>
-      <w:r>
-        <w:rPr>
-          <w:rFonts w:ascii="Consolas" w:hAnsi="Consolas"/>
-          <w:lang w:val="pt-BR"/>
-        </w:rPr>
-        <w:t>)])</w:t>
-      </w:r>
-      <w:r>
-        <w:rPr>
-          <w:lang w:val="pt-BR"/>
-        </w:rPr>
-        <w:br/>
-      </w:r>
-      <w:proofErr w:type="spellStart"/>
-      <w:proofErr w:type="gramStart"/>
-      <w:r>
-        <w:rPr>
-          <w:rFonts w:ascii="Consolas" w:hAnsi="Consolas"/>
-          <w:lang w:val="pt-BR"/>
-        </w:rPr>
-        <w:t>report.run</w:t>
-      </w:r>
-      <w:proofErr w:type="spellEnd"/>
-      <w:r>
-        <w:rPr>
-          <w:rFonts w:ascii="Consolas" w:hAnsi="Consolas"/>
-          <w:lang w:val="pt-BR"/>
-        </w:rPr>
-        <w:t>(</w:t>
-      </w:r>
-      <w:proofErr w:type="spellStart"/>
-      <w:proofErr w:type="gramEnd"/>
-      <w:r>
-        <w:rPr>
-          <w:rFonts w:ascii="Consolas" w:hAnsi="Consolas"/>
-          <w:lang w:val="pt-BR"/>
-        </w:rPr>
-        <w:t>reference_data</w:t>
-      </w:r>
-      <w:proofErr w:type="spellEnd"/>
-      <w:r>
-        <w:rPr>
-          <w:rFonts w:ascii="Consolas" w:hAnsi="Consolas"/>
-          <w:lang w:val="pt-BR"/>
-        </w:rPr>
-        <w:t>=</w:t>
-      </w:r>
-      <w:proofErr w:type="spellStart"/>
-      <w:r>
-        <w:rPr>
-          <w:rFonts w:ascii="Consolas" w:hAnsi="Consolas"/>
-          <w:lang w:val="pt-BR"/>
-        </w:rPr>
-        <w:t>dados_treino</w:t>
-      </w:r>
-      <w:proofErr w:type="spellEnd"/>
-      <w:r>
-        <w:rPr>
-          <w:rFonts w:ascii="Consolas" w:hAnsi="Consolas"/>
-          <w:lang w:val="pt-BR"/>
-        </w:rPr>
-        <w:t xml:space="preserve">, </w:t>
-      </w:r>
-      <w:proofErr w:type="spellStart"/>
-      <w:r>
-        <w:rPr>
-          <w:rFonts w:ascii="Consolas" w:hAnsi="Consolas"/>
-          <w:lang w:val="pt-BR"/>
-        </w:rPr>
-        <w:t>current_data</w:t>
-      </w:r>
-      <w:proofErr w:type="spellEnd"/>
-      <w:r>
-        <w:rPr>
-          <w:rFonts w:ascii="Consolas" w:hAnsi="Consolas"/>
-          <w:lang w:val="pt-BR"/>
-        </w:rPr>
-        <w:t>=</w:t>
-      </w:r>
-      <w:proofErr w:type="spellStart"/>
-      <w:r>
-        <w:rPr>
-          <w:rFonts w:ascii="Consolas" w:hAnsi="Consolas"/>
-          <w:lang w:val="pt-BR"/>
-        </w:rPr>
-        <w:t>dados_producao</w:t>
-      </w:r>
-      <w:proofErr w:type="spellEnd"/>
-      <w:r>
-        <w:rPr>
-          <w:rFonts w:ascii="Consolas" w:hAnsi="Consolas"/>
-          <w:lang w:val="pt-BR"/>
-        </w:rPr>
-        <w:t>)</w:t>
-      </w:r>
-      <w:r>
-        <w:rPr>
-          <w:lang w:val="pt-BR"/>
-        </w:rPr>
-        <w:br/>
-      </w:r>
-      <w:proofErr w:type="spellStart"/>
-      <w:proofErr w:type="gramStart"/>
-      <w:r>
-        <w:rPr>
-          <w:rFonts w:ascii="Consolas" w:hAnsi="Consolas"/>
-          <w:lang w:val="pt-BR"/>
-        </w:rPr>
-        <w:t>report.save</w:t>
-      </w:r>
-      <w:proofErr w:type="gramEnd"/>
-      <w:r>
-        <w:rPr>
-          <w:rFonts w:ascii="Consolas" w:hAnsi="Consolas"/>
-          <w:lang w:val="pt-BR"/>
-        </w:rPr>
-        <w:t>_html</w:t>
-      </w:r>
-      <w:proofErr w:type="spellEnd"/>
-      <w:r>
-        <w:rPr>
-          <w:rFonts w:ascii="Consolas" w:hAnsi="Consolas"/>
-          <w:lang w:val="pt-BR"/>
-        </w:rPr>
-        <w:t>("relatorio_drift.html")</w:t>
+        <w:t xml:space="preserve">resultado.save_html("relatorio_drift.html")</w:t>
       </w:r>
     </w:p>
     <w:p>
@@ -3258,15 +2659,7 @@
         <w:pStyle w:val="BodyText"/>
       </w:pPr>
       <w:r>
-        <w:t xml:space="preserve">Uma arquitetura típica de monitoramento coleta as predições e as entradas do modelo em produção, armazena-as, compara periodicamente com a janela de referência, calcula métricas de drift e performance, exibe tudo em um dashboard e dispara alertas ou </w:t>
-      </w:r>
-      <w:proofErr w:type="gramStart"/>
-      <w:r>
-        <w:t>re-treino</w:t>
-      </w:r>
-      <w:proofErr w:type="gramEnd"/>
-      <w:r>
-        <w:t xml:space="preserve"> quando necessário. O monitoramento fecha o ciclo de vida do modelo, transformando-o em um processo contínuo em vez de um evento único.</w:t>
+        <w:t xml:space="preserve">Uma arquitetura típica de monitoramento coleta as predições e as entradas do modelo em produção, armazena-as, compara periodicamente com a janela de referência, calcula métricas de drift e performance, exibe tudo em um dashboard e dispara alertas ou re-treino quando necessário. O monitoramento fecha o ciclo de vida do modelo, transformando-o em um processo contínuo em vez de um evento único.</w:t>
       </w:r>
     </w:p>
     <w:p>
@@ -3298,15 +2691,7 @@
         <w:pStyle w:val="BodyText"/>
       </w:pPr>
       <w:r>
-        <w:t xml:space="preserve">Uma tendência forte é o surgimento de plataformas dedicadas de ML Observability, como Evidently AI, Arize, WhyLabs e Fiddler, que oferecem monitoramento de drift, performance e fairness prontos para uso. Outra tendência é a integração do monitoramento com práticas de Continuous Training, em que a detecção de drift dispara automaticamente pipelines de </w:t>
-      </w:r>
-      <w:proofErr w:type="gramStart"/>
-      <w:r>
-        <w:t>re-treino</w:t>
-      </w:r>
-      <w:proofErr w:type="gramEnd"/>
-      <w:r>
-        <w:t>, aproximando o monitoramento das práticas de MLOps maduras.</w:t>
+        <w:t xml:space="preserve">Uma tendência forte é o surgimento de plataformas dedicadas de ML Observability, como Evidently AI, Arize, WhyLabs e Fiddler, que oferecem monitoramento de drift, performance e fairness prontos para uso. Outra tendência é a integração do monitoramento com práticas de Continuous Training, em que a detecção de drift dispara automaticamente pipelines de re-treino, aproximando o monitoramento das práticas de MLOps maduras.</w:t>
       </w:r>
     </w:p>
     <w:p>

</xml_diff>